<commit_message>
Compte-rendu captures : premier lot inséré
Co-Authored-By: Claude Opus 5.5 <noreply@anthropic.com>
Claude-Session: https://claude.ai/code/session_01GwYZ2M9bGGfxXNKmZJHXRS
</commit_message>
<xml_diff>
--- a/CR_TP_Infra_PME_Captures.docx
+++ b/CR_TP_Infra_PME_Captures.docx
@@ -731,7 +731,7 @@
           <wp:inline distT="0" distB="0" distL="0" distR="0">
             <wp:extent cx="5715000" cy="2714625"/>
             <wp:effectExtent t="0" r="0" b="0" l="0"/>
-            <wp:docPr id="1" name="18.jpg" descr="Capture d’écran" title="18.jpg"/>
+            <wp:docPr id="1" name="23.jpg" descr="Capture d’écran" title="23.jpg"/>
             <wp:cNvGraphicFramePr>
               <a:graphicFrameLocks xmlns:a="http://schemas.openxmlformats.org/drawingml/2006/main" noChangeAspect="1"/>
             </wp:cNvGraphicFramePr>
@@ -794,7 +794,7 @@
           <wp:inline distT="0" distB="0" distL="0" distR="0">
             <wp:extent cx="5715000" cy="3048000"/>
             <wp:effectExtent t="0" r="0" b="0" l="0"/>
-            <wp:docPr id="1" name="19.png" descr="Capture d’écran" title="19.png"/>
+            <wp:docPr id="1" name="24.png" descr="Capture d’écran" title="24.png"/>
             <wp:cNvGraphicFramePr>
               <a:graphicFrameLocks xmlns:a="http://schemas.openxmlformats.org/drawingml/2006/main" noChangeAspect="1"/>
             </wp:cNvGraphicFramePr>
@@ -855,9 +855,9 @@
       <w:r>
         <w:drawing>
           <wp:inline distT="0" distB="0" distL="0" distR="0">
-            <wp:extent cx="5715000" cy="2647950"/>
+            <wp:extent cx="5715000" cy="695325"/>
             <wp:effectExtent t="0" r="0" b="0" l="0"/>
-            <wp:docPr id="1" name="4.png" descr="Capture d’écran" title="4.png"/>
+            <wp:docPr id="1" name="25.png" descr="Capture d’écran" title="25.png"/>
             <wp:cNvGraphicFramePr>
               <a:graphicFrameLocks xmlns:a="http://schemas.openxmlformats.org/drawingml/2006/main" noChangeAspect="1"/>
             </wp:cNvGraphicFramePr>
@@ -880,7 +880,7 @@
                   <pic:spPr bwMode="auto">
                     <a:xfrm>
                       <a:off x="0" y="0"/>
-                      <a:ext cx="5715000" cy="2647950"/>
+                      <a:ext cx="5715000" cy="695325"/>
                     </a:xfrm>
                     <a:prstGeom prst="rect">
                       <a:avLst/>
@@ -918,9 +918,9 @@
       <w:r>
         <w:drawing>
           <wp:inline distT="0" distB="0" distL="0" distR="0">
-            <wp:extent cx="5715000" cy="695325"/>
+            <wp:extent cx="5715000" cy="3409950"/>
             <wp:effectExtent t="0" r="0" b="0" l="0"/>
-            <wp:docPr id="1" name="20.png" descr="Capture d’écran" title="20.png"/>
+            <wp:docPr id="1" name="21.png" descr="Capture d’écran" title="21.png"/>
             <wp:cNvGraphicFramePr>
               <a:graphicFrameLocks xmlns:a="http://schemas.openxmlformats.org/drawingml/2006/main" noChangeAspect="1"/>
             </wp:cNvGraphicFramePr>
@@ -943,7 +943,7 @@
                   <pic:spPr bwMode="auto">
                     <a:xfrm>
                       <a:off x="0" y="0"/>
-                      <a:ext cx="5715000" cy="695325"/>
+                      <a:ext cx="5715000" cy="3409950"/>
                     </a:xfrm>
                     <a:prstGeom prst="rect">
                       <a:avLst/>
@@ -973,144 +973,6 @@
         <w:t xml:space="preserve">Je teste que le routeur sort sur Internet.</w:t>
       </w:r>
     </w:p>
-    <w:tbl>
-      <w:tblPr>
-        <w:tblW w:type="dxa" w:w="9638"/>
-        <w:tblBorders>
-          <w:top w:val="single" w:color="auto" w:sz="4"/>
-          <w:left w:val="single" w:color="auto" w:sz="4"/>
-          <w:bottom w:val="single" w:color="auto" w:sz="4"/>
-          <w:right w:val="single" w:color="auto" w:sz="4"/>
-          <w:insideH w:val="single" w:color="auto" w:sz="4"/>
-          <w:insideV w:val="single" w:color="auto" w:sz="4"/>
-        </w:tblBorders>
-      </w:tblPr>
-      <w:tblGrid>
-        <w:gridCol w:w="9638"/>
-      </w:tblGrid>
-      <w:tr>
-        <w:trPr>
-          <w:trHeight w:val="2200" w:hRule="atLeast"/>
-        </w:trPr>
-        <w:tc>
-          <w:tcPr>
-            <w:tcW w:type="dxa" w:w="9638"/>
-            <w:tcBorders>
-              <w:top w:val="dashed" w:color="8EA9C8" w:sz="8"/>
-              <w:left w:val="dashed" w:color="8EA9C8" w:sz="8"/>
-              <w:bottom w:val="dashed" w:color="8EA9C8" w:sz="8"/>
-              <w:right w:val="dashed" w:color="8EA9C8" w:sz="8"/>
-            </w:tcBorders>
-            <w:shd w:fill="F3F7FB" w:color="auto" w:val="clear"/>
-            <w:vAlign w:val="center"/>
-          </w:tcPr>
-          <w:p>
-            <w:pPr>
-              <w:jc w:val="center"/>
-            </w:pPr>
-            <w:r>
-              <w:rPr>
-                <w:b/>
-                <w:bCs/>
-                <w:color w:val="5B7FA6"/>
-              </w:rPr>
-              <w:t xml:space="preserve">[ Coller la capture ici ]</w:t>
-            </w:r>
-          </w:p>
-        </w:tc>
-      </w:tr>
-    </w:tbl>
-    <w:p>
-      <w:pPr>
-        <w:spacing w:after="200"/>
-      </w:pPr>
-    </w:p>
-    <w:p>
-      <w:pPr>
-        <w:keepNext/>
-        <w:spacing w:after="80" w:before="160"/>
-      </w:pPr>
-      <w:r>
-        <w:rPr>
-          <w:b/>
-          <w:bCs/>
-          <w:color w:val="1F4E79"/>
-        </w:rPr>
-        <w:t xml:space="preserve">Capture 6 : </w:t>
-      </w:r>
-      <w:r>
-        <w:t xml:space="preserve">Je teste qu’un serveur du LAN sort sur Internet grâce au NAT.</w:t>
-      </w:r>
-    </w:p>
-    <w:tbl>
-      <w:tblPr>
-        <w:tblW w:type="dxa" w:w="9638"/>
-        <w:tblBorders>
-          <w:top w:val="single" w:color="auto" w:sz="4"/>
-          <w:left w:val="single" w:color="auto" w:sz="4"/>
-          <w:bottom w:val="single" w:color="auto" w:sz="4"/>
-          <w:right w:val="single" w:color="auto" w:sz="4"/>
-          <w:insideH w:val="single" w:color="auto" w:sz="4"/>
-          <w:insideV w:val="single" w:color="auto" w:sz="4"/>
-        </w:tblBorders>
-      </w:tblPr>
-      <w:tblGrid>
-        <w:gridCol w:w="9638"/>
-      </w:tblGrid>
-      <w:tr>
-        <w:trPr>
-          <w:trHeight w:val="2200" w:hRule="atLeast"/>
-        </w:trPr>
-        <w:tc>
-          <w:tcPr>
-            <w:tcW w:type="dxa" w:w="9638"/>
-            <w:tcBorders>
-              <w:top w:val="dashed" w:color="8EA9C8" w:sz="8"/>
-              <w:left w:val="dashed" w:color="8EA9C8" w:sz="8"/>
-              <w:bottom w:val="dashed" w:color="8EA9C8" w:sz="8"/>
-              <w:right w:val="dashed" w:color="8EA9C8" w:sz="8"/>
-            </w:tcBorders>
-            <w:shd w:fill="F3F7FB" w:color="auto" w:val="clear"/>
-            <w:vAlign w:val="center"/>
-          </w:tcPr>
-          <w:p>
-            <w:pPr>
-              <w:jc w:val="center"/>
-            </w:pPr>
-            <w:r>
-              <w:rPr>
-                <w:b/>
-                <w:bCs/>
-                <w:color w:val="5B7FA6"/>
-              </w:rPr>
-              <w:t xml:space="preserve">[ Coller la capture ici ]</w:t>
-            </w:r>
-          </w:p>
-        </w:tc>
-      </w:tr>
-    </w:tbl>
-    <w:p>
-      <w:pPr>
-        <w:spacing w:after="200"/>
-      </w:pPr>
-    </w:p>
-    <w:p>
-      <w:pPr>
-        <w:keepNext/>
-        <w:spacing w:after="80" w:before="160"/>
-      </w:pPr>
-      <w:r>
-        <w:rPr>
-          <w:b/>
-          <w:bCs/>
-          <w:color w:val="1F4E79"/>
-        </w:rPr>
-        <w:t xml:space="preserve">Capture 7 : </w:t>
-      </w:r>
-      <w:r>
-        <w:t xml:space="preserve">Le client reçoit son adresse, sa passerelle et son DNS par DHCP.</w:t>
-      </w:r>
-    </w:p>
     <w:p>
       <w:pPr>
         <w:spacing w:after="240"/>
@@ -1119,9 +981,9 @@
       <w:r>
         <w:drawing>
           <wp:inline distT="0" distB="0" distL="0" distR="0">
-            <wp:extent cx="5715000" cy="2447925"/>
+            <wp:extent cx="5715000" cy="2981325"/>
             <wp:effectExtent t="0" r="0" b="0" l="0"/>
-            <wp:docPr id="1" name="14.png" descr="Capture d’écran" title="14.png"/>
+            <wp:docPr id="1" name="22.png" descr="Capture d’écran" title="22.png"/>
             <wp:cNvGraphicFramePr>
               <a:graphicFrameLocks xmlns:a="http://schemas.openxmlformats.org/drawingml/2006/main" noChangeAspect="1"/>
             </wp:cNvGraphicFramePr>
@@ -1144,7 +1006,7 @@
                   <pic:spPr bwMode="auto">
                     <a:xfrm>
                       <a:off x="0" y="0"/>
-                      <a:ext cx="5715000" cy="2447925"/>
+                      <a:ext cx="5715000" cy="2981325"/>
                     </a:xfrm>
                     <a:prstGeom prst="rect">
                       <a:avLst/>
@@ -1168,10 +1030,10 @@
           <w:bCs/>
           <w:color w:val="1F4E79"/>
         </w:rPr>
-        <w:t xml:space="preserve">Capture 8 : </w:t>
-      </w:r>
-      <w:r>
-        <w:t xml:space="preserve">Je vérifie l’échange DHCP et le bail sur le serveur Kea.</w:t>
+        <w:t xml:space="preserve">Capture 6 : </w:t>
+      </w:r>
+      <w:r>
+        <w:t xml:space="preserve">Je teste qu’un serveur du LAN sort sur Internet grâce au NAT.</w:t>
       </w:r>
     </w:p>
     <w:tbl>
@@ -1237,976 +1099,10 @@
           <w:bCs/>
           <w:color w:val="1F4E79"/>
         </w:rPr>
-        <w:t xml:space="preserve">Capture 9 : </w:t>
-      </w:r>
-      <w:r>
-        <w:t xml:space="preserve">Je vérifie qu’un seul serveur DHCP répond sur le réseau.</w:t>
-      </w:r>
-    </w:p>
-    <w:tbl>
-      <w:tblPr>
-        <w:tblW w:type="dxa" w:w="9638"/>
-        <w:tblBorders>
-          <w:top w:val="single" w:color="auto" w:sz="4"/>
-          <w:left w:val="single" w:color="auto" w:sz="4"/>
-          <w:bottom w:val="single" w:color="auto" w:sz="4"/>
-          <w:right w:val="single" w:color="auto" w:sz="4"/>
-          <w:insideH w:val="single" w:color="auto" w:sz="4"/>
-          <w:insideV w:val="single" w:color="auto" w:sz="4"/>
-        </w:tblBorders>
-      </w:tblPr>
-      <w:tblGrid>
-        <w:gridCol w:w="9638"/>
-      </w:tblGrid>
-      <w:tr>
-        <w:trPr>
-          <w:trHeight w:val="2200" w:hRule="atLeast"/>
-        </w:trPr>
-        <w:tc>
-          <w:tcPr>
-            <w:tcW w:type="dxa" w:w="9638"/>
-            <w:tcBorders>
-              <w:top w:val="dashed" w:color="8EA9C8" w:sz="8"/>
-              <w:left w:val="dashed" w:color="8EA9C8" w:sz="8"/>
-              <w:bottom w:val="dashed" w:color="8EA9C8" w:sz="8"/>
-              <w:right w:val="dashed" w:color="8EA9C8" w:sz="8"/>
-            </w:tcBorders>
-            <w:shd w:fill="F3F7FB" w:color="auto" w:val="clear"/>
-            <w:vAlign w:val="center"/>
-          </w:tcPr>
-          <w:p>
-            <w:pPr>
-              <w:jc w:val="center"/>
-            </w:pPr>
-            <w:r>
-              <w:rPr>
-                <w:b/>
-                <w:bCs/>
-                <w:color w:val="5B7FA6"/>
-              </w:rPr>
-              <w:t xml:space="preserve">[ Coller la capture ici ]</w:t>
-            </w:r>
-          </w:p>
-        </w:tc>
-      </w:tr>
-    </w:tbl>
-    <w:p>
-      <w:pPr>
-        <w:spacing w:after="200"/>
-      </w:pPr>
-    </w:p>
-    <w:p>
-      <w:pPr>
-        <w:keepNext/>
-        <w:spacing w:after="80" w:before="160"/>
-      </w:pPr>
-      <w:r>
-        <w:rPr>
-          <w:b/>
-          <w:bCs/>
-          <w:color w:val="1F4E79"/>
-        </w:rPr>
-        <w:t xml:space="preserve">Capture 10 : </w:t>
-      </w:r>
-      <w:r>
-        <w:t xml:space="preserve">Je vérifie que c’est AdGuard (192.168.10.3) qui répond aux requêtes DNS.</w:t>
-      </w:r>
-    </w:p>
-    <w:tbl>
-      <w:tblPr>
-        <w:tblW w:type="dxa" w:w="9638"/>
-        <w:tblBorders>
-          <w:top w:val="single" w:color="auto" w:sz="4"/>
-          <w:left w:val="single" w:color="auto" w:sz="4"/>
-          <w:bottom w:val="single" w:color="auto" w:sz="4"/>
-          <w:right w:val="single" w:color="auto" w:sz="4"/>
-          <w:insideH w:val="single" w:color="auto" w:sz="4"/>
-          <w:insideV w:val="single" w:color="auto" w:sz="4"/>
-        </w:tblBorders>
-      </w:tblPr>
-      <w:tblGrid>
-        <w:gridCol w:w="9638"/>
-      </w:tblGrid>
-      <w:tr>
-        <w:trPr>
-          <w:trHeight w:val="2200" w:hRule="atLeast"/>
-        </w:trPr>
-        <w:tc>
-          <w:tcPr>
-            <w:tcW w:type="dxa" w:w="9638"/>
-            <w:tcBorders>
-              <w:top w:val="dashed" w:color="8EA9C8" w:sz="8"/>
-              <w:left w:val="dashed" w:color="8EA9C8" w:sz="8"/>
-              <w:bottom w:val="dashed" w:color="8EA9C8" w:sz="8"/>
-              <w:right w:val="dashed" w:color="8EA9C8" w:sz="8"/>
-            </w:tcBorders>
-            <w:shd w:fill="F3F7FB" w:color="auto" w:val="clear"/>
-            <w:vAlign w:val="center"/>
-          </w:tcPr>
-          <w:p>
-            <w:pPr>
-              <w:jc w:val="center"/>
-            </w:pPr>
-            <w:r>
-              <w:rPr>
-                <w:b/>
-                <w:bCs/>
-                <w:color w:val="5B7FA6"/>
-              </w:rPr>
-              <w:t xml:space="preserve">[ Coller la capture ici ]</w:t>
-            </w:r>
-          </w:p>
-        </w:tc>
-      </w:tr>
-    </w:tbl>
-    <w:p>
-      <w:pPr>
-        <w:spacing w:after="200"/>
-      </w:pPr>
-    </w:p>
-    <w:p>
-      <w:pPr>
-        <w:keepNext/>
-        <w:spacing w:after="80" w:before="160"/>
-      </w:pPr>
-      <w:r>
-        <w:rPr>
-          <w:b/>
-          <w:bCs/>
-          <w:color w:val="1F4E79"/>
-        </w:rPr>
-        <w:t xml:space="preserve">Capture 11 : </w:t>
-      </w:r>
-      <w:r>
-        <w:t xml:space="preserve">Le client navigue sur Internet (YouTube).</w:t>
-      </w:r>
-    </w:p>
-    <w:tbl>
-      <w:tblPr>
-        <w:tblW w:type="dxa" w:w="9638"/>
-        <w:tblBorders>
-          <w:top w:val="single" w:color="auto" w:sz="4"/>
-          <w:left w:val="single" w:color="auto" w:sz="4"/>
-          <w:bottom w:val="single" w:color="auto" w:sz="4"/>
-          <w:right w:val="single" w:color="auto" w:sz="4"/>
-          <w:insideH w:val="single" w:color="auto" w:sz="4"/>
-          <w:insideV w:val="single" w:color="auto" w:sz="4"/>
-        </w:tblBorders>
-      </w:tblPr>
-      <w:tblGrid>
-        <w:gridCol w:w="9638"/>
-      </w:tblGrid>
-      <w:tr>
-        <w:trPr>
-          <w:trHeight w:val="2200" w:hRule="atLeast"/>
-        </w:trPr>
-        <w:tc>
-          <w:tcPr>
-            <w:tcW w:type="dxa" w:w="9638"/>
-            <w:tcBorders>
-              <w:top w:val="dashed" w:color="8EA9C8" w:sz="8"/>
-              <w:left w:val="dashed" w:color="8EA9C8" w:sz="8"/>
-              <w:bottom w:val="dashed" w:color="8EA9C8" w:sz="8"/>
-              <w:right w:val="dashed" w:color="8EA9C8" w:sz="8"/>
-            </w:tcBorders>
-            <w:shd w:fill="F3F7FB" w:color="auto" w:val="clear"/>
-            <w:vAlign w:val="center"/>
-          </w:tcPr>
-          <w:p>
-            <w:pPr>
-              <w:jc w:val="center"/>
-            </w:pPr>
-            <w:r>
-              <w:rPr>
-                <w:b/>
-                <w:bCs/>
-                <w:color w:val="5B7FA6"/>
-              </w:rPr>
-              <w:t xml:space="preserve">[ Coller la capture ici ]</w:t>
-            </w:r>
-          </w:p>
-        </w:tc>
-      </w:tr>
-    </w:tbl>
-    <w:p>
-      <w:pPr>
-        <w:spacing w:after="200"/>
-      </w:pPr>
-    </w:p>
-    <w:p>
-      <w:pPr>
-        <w:keepNext/>
-        <w:spacing w:after="80" w:before="160"/>
-      </w:pPr>
-      <w:r>
-        <w:rPr>
-          <w:b/>
-          <w:bCs/>
-          <w:color w:val="1F4E79"/>
-        </w:rPr>
-        <w:t xml:space="preserve">Capture 12 : </w:t>
-      </w:r>
-      <w:r>
-        <w:t xml:space="preserve">La requête youtube.com apparaît dans le journal d’AdGuard.</w:t>
-      </w:r>
-    </w:p>
-    <w:tbl>
-      <w:tblPr>
-        <w:tblW w:type="dxa" w:w="9638"/>
-        <w:tblBorders>
-          <w:top w:val="single" w:color="auto" w:sz="4"/>
-          <w:left w:val="single" w:color="auto" w:sz="4"/>
-          <w:bottom w:val="single" w:color="auto" w:sz="4"/>
-          <w:right w:val="single" w:color="auto" w:sz="4"/>
-          <w:insideH w:val="single" w:color="auto" w:sz="4"/>
-          <w:insideV w:val="single" w:color="auto" w:sz="4"/>
-        </w:tblBorders>
-      </w:tblPr>
-      <w:tblGrid>
-        <w:gridCol w:w="9638"/>
-      </w:tblGrid>
-      <w:tr>
-        <w:trPr>
-          <w:trHeight w:val="2200" w:hRule="atLeast"/>
-        </w:trPr>
-        <w:tc>
-          <w:tcPr>
-            <w:tcW w:type="dxa" w:w="9638"/>
-            <w:tcBorders>
-              <w:top w:val="dashed" w:color="8EA9C8" w:sz="8"/>
-              <w:left w:val="dashed" w:color="8EA9C8" w:sz="8"/>
-              <w:bottom w:val="dashed" w:color="8EA9C8" w:sz="8"/>
-              <w:right w:val="dashed" w:color="8EA9C8" w:sz="8"/>
-            </w:tcBorders>
-            <w:shd w:fill="F3F7FB" w:color="auto" w:val="clear"/>
-            <w:vAlign w:val="center"/>
-          </w:tcPr>
-          <w:p>
-            <w:pPr>
-              <w:jc w:val="center"/>
-            </w:pPr>
-            <w:r>
-              <w:rPr>
-                <w:b/>
-                <w:bCs/>
-                <w:color w:val="5B7FA6"/>
-              </w:rPr>
-              <w:t xml:space="preserve">[ Coller la capture ici ]</w:t>
-            </w:r>
-          </w:p>
-        </w:tc>
-      </w:tr>
-    </w:tbl>
-    <w:p>
-      <w:pPr>
-        <w:spacing w:after="200"/>
-      </w:pPr>
-    </w:p>
-    <w:p>
-      <w:pPr>
-        <w:keepNext/>
-        <w:spacing w:after="80" w:before="160"/>
-      </w:pPr>
-      <w:r>
-        <w:rPr>
-          <w:b/>
-          <w:bCs/>
-          <w:color w:val="1F4E79"/>
-        </w:rPr>
-        <w:t xml:space="preserve">Capture 13 : </w:t>
-      </w:r>
-      <w:r>
-        <w:t xml:space="preserve">Je vérifie qu’Apache tourne sur srv-web.</w:t>
-      </w:r>
-    </w:p>
-    <w:tbl>
-      <w:tblPr>
-        <w:tblW w:type="dxa" w:w="9638"/>
-        <w:tblBorders>
-          <w:top w:val="single" w:color="auto" w:sz="4"/>
-          <w:left w:val="single" w:color="auto" w:sz="4"/>
-          <w:bottom w:val="single" w:color="auto" w:sz="4"/>
-          <w:right w:val="single" w:color="auto" w:sz="4"/>
-          <w:insideH w:val="single" w:color="auto" w:sz="4"/>
-          <w:insideV w:val="single" w:color="auto" w:sz="4"/>
-        </w:tblBorders>
-      </w:tblPr>
-      <w:tblGrid>
-        <w:gridCol w:w="9638"/>
-      </w:tblGrid>
-      <w:tr>
-        <w:trPr>
-          <w:trHeight w:val="2200" w:hRule="atLeast"/>
-        </w:trPr>
-        <w:tc>
-          <w:tcPr>
-            <w:tcW w:type="dxa" w:w="9638"/>
-            <w:tcBorders>
-              <w:top w:val="dashed" w:color="8EA9C8" w:sz="8"/>
-              <w:left w:val="dashed" w:color="8EA9C8" w:sz="8"/>
-              <w:bottom w:val="dashed" w:color="8EA9C8" w:sz="8"/>
-              <w:right w:val="dashed" w:color="8EA9C8" w:sz="8"/>
-            </w:tcBorders>
-            <w:shd w:fill="F3F7FB" w:color="auto" w:val="clear"/>
-            <w:vAlign w:val="center"/>
-          </w:tcPr>
-          <w:p>
-            <w:pPr>
-              <w:jc w:val="center"/>
-            </w:pPr>
-            <w:r>
-              <w:rPr>
-                <w:b/>
-                <w:bCs/>
-                <w:color w:val="5B7FA6"/>
-              </w:rPr>
-              <w:t xml:space="preserve">[ Coller la capture ici ]</w:t>
-            </w:r>
-          </w:p>
-        </w:tc>
-      </w:tr>
-    </w:tbl>
-    <w:p>
-      <w:pPr>
-        <w:spacing w:after="200"/>
-      </w:pPr>
-    </w:p>
-    <w:p>
-      <w:pPr>
-        <w:keepNext/>
-        <w:spacing w:after="80" w:before="160"/>
-      </w:pPr>
-      <w:r>
-        <w:rPr>
-          <w:b/>
-          <w:bCs/>
-          <w:color w:val="1F4E79"/>
-        </w:rPr>
-        <w:t xml:space="preserve">Capture 14 : </w:t>
-      </w:r>
-      <w:r>
-        <w:t xml:space="preserve">La page web s’ouvre avec l’adresse IP du serveur.</w:t>
-      </w:r>
-    </w:p>
-    <w:tbl>
-      <w:tblPr>
-        <w:tblW w:type="dxa" w:w="9638"/>
-        <w:tblBorders>
-          <w:top w:val="single" w:color="auto" w:sz="4"/>
-          <w:left w:val="single" w:color="auto" w:sz="4"/>
-          <w:bottom w:val="single" w:color="auto" w:sz="4"/>
-          <w:right w:val="single" w:color="auto" w:sz="4"/>
-          <w:insideH w:val="single" w:color="auto" w:sz="4"/>
-          <w:insideV w:val="single" w:color="auto" w:sz="4"/>
-        </w:tblBorders>
-      </w:tblPr>
-      <w:tblGrid>
-        <w:gridCol w:w="9638"/>
-      </w:tblGrid>
-      <w:tr>
-        <w:trPr>
-          <w:trHeight w:val="2200" w:hRule="atLeast"/>
-        </w:trPr>
-        <w:tc>
-          <w:tcPr>
-            <w:tcW w:type="dxa" w:w="9638"/>
-            <w:tcBorders>
-              <w:top w:val="dashed" w:color="8EA9C8" w:sz="8"/>
-              <w:left w:val="dashed" w:color="8EA9C8" w:sz="8"/>
-              <w:bottom w:val="dashed" w:color="8EA9C8" w:sz="8"/>
-              <w:right w:val="dashed" w:color="8EA9C8" w:sz="8"/>
-            </w:tcBorders>
-            <w:shd w:fill="F3F7FB" w:color="auto" w:val="clear"/>
-            <w:vAlign w:val="center"/>
-          </w:tcPr>
-          <w:p>
-            <w:pPr>
-              <w:jc w:val="center"/>
-            </w:pPr>
-            <w:r>
-              <w:rPr>
-                <w:b/>
-                <w:bCs/>
-                <w:color w:val="5B7FA6"/>
-              </w:rPr>
-              <w:t xml:space="preserve">[ Coller la capture ici ]</w:t>
-            </w:r>
-          </w:p>
-        </w:tc>
-      </w:tr>
-    </w:tbl>
-    <w:p>
-      <w:pPr>
-        <w:spacing w:after="200"/>
-      </w:pPr>
-    </w:p>
-    <w:p>
-      <w:pPr>
-        <w:keepNext/>
-        <w:spacing w:after="80" w:before="160"/>
-      </w:pPr>
-      <w:r>
-        <w:rPr>
-          <w:b/>
-          <w:bCs/>
-          <w:color w:val="1F4E79"/>
-        </w:rPr>
-        <w:t xml:space="preserve">Capture 15 : </w:t>
-      </w:r>
-      <w:r>
-        <w:t xml:space="preserve">Avant la réécriture, le nom app.pme.lan n’existe pas.</w:t>
-      </w:r>
-    </w:p>
-    <w:tbl>
-      <w:tblPr>
-        <w:tblW w:type="dxa" w:w="9638"/>
-        <w:tblBorders>
-          <w:top w:val="single" w:color="auto" w:sz="4"/>
-          <w:left w:val="single" w:color="auto" w:sz="4"/>
-          <w:bottom w:val="single" w:color="auto" w:sz="4"/>
-          <w:right w:val="single" w:color="auto" w:sz="4"/>
-          <w:insideH w:val="single" w:color="auto" w:sz="4"/>
-          <w:insideV w:val="single" w:color="auto" w:sz="4"/>
-        </w:tblBorders>
-      </w:tblPr>
-      <w:tblGrid>
-        <w:gridCol w:w="9638"/>
-      </w:tblGrid>
-      <w:tr>
-        <w:trPr>
-          <w:trHeight w:val="2200" w:hRule="atLeast"/>
-        </w:trPr>
-        <w:tc>
-          <w:tcPr>
-            <w:tcW w:type="dxa" w:w="9638"/>
-            <w:tcBorders>
-              <w:top w:val="dashed" w:color="8EA9C8" w:sz="8"/>
-              <w:left w:val="dashed" w:color="8EA9C8" w:sz="8"/>
-              <w:bottom w:val="dashed" w:color="8EA9C8" w:sz="8"/>
-              <w:right w:val="dashed" w:color="8EA9C8" w:sz="8"/>
-            </w:tcBorders>
-            <w:shd w:fill="F3F7FB" w:color="auto" w:val="clear"/>
-            <w:vAlign w:val="center"/>
-          </w:tcPr>
-          <w:p>
-            <w:pPr>
-              <w:jc w:val="center"/>
-            </w:pPr>
-            <w:r>
-              <w:rPr>
-                <w:b/>
-                <w:bCs/>
-                <w:color w:val="5B7FA6"/>
-              </w:rPr>
-              <w:t xml:space="preserve">[ Coller la capture ici ]</w:t>
-            </w:r>
-          </w:p>
-        </w:tc>
-      </w:tr>
-    </w:tbl>
-    <w:p>
-      <w:pPr>
-        <w:spacing w:after="200"/>
-      </w:pPr>
-    </w:p>
-    <w:p>
-      <w:pPr>
-        <w:keepNext/>
-        <w:spacing w:after="80" w:before="160"/>
-      </w:pPr>
-      <w:r>
-        <w:rPr>
-          <w:b/>
-          <w:bCs/>
-          <w:color w:val="1F4E79"/>
-        </w:rPr>
-        <w:t xml:space="preserve">Capture 16 : </w:t>
-      </w:r>
-      <w:r>
-        <w:t xml:space="preserve">J’ajoute la réécriture app.pme.lan vers 192.168.10.4 dans AdGuard.</w:t>
-      </w:r>
-    </w:p>
-    <w:tbl>
-      <w:tblPr>
-        <w:tblW w:type="dxa" w:w="9638"/>
-        <w:tblBorders>
-          <w:top w:val="single" w:color="auto" w:sz="4"/>
-          <w:left w:val="single" w:color="auto" w:sz="4"/>
-          <w:bottom w:val="single" w:color="auto" w:sz="4"/>
-          <w:right w:val="single" w:color="auto" w:sz="4"/>
-          <w:insideH w:val="single" w:color="auto" w:sz="4"/>
-          <w:insideV w:val="single" w:color="auto" w:sz="4"/>
-        </w:tblBorders>
-      </w:tblPr>
-      <w:tblGrid>
-        <w:gridCol w:w="9638"/>
-      </w:tblGrid>
-      <w:tr>
-        <w:trPr>
-          <w:trHeight w:val="2200" w:hRule="atLeast"/>
-        </w:trPr>
-        <w:tc>
-          <w:tcPr>
-            <w:tcW w:type="dxa" w:w="9638"/>
-            <w:tcBorders>
-              <w:top w:val="dashed" w:color="8EA9C8" w:sz="8"/>
-              <w:left w:val="dashed" w:color="8EA9C8" w:sz="8"/>
-              <w:bottom w:val="dashed" w:color="8EA9C8" w:sz="8"/>
-              <w:right w:val="dashed" w:color="8EA9C8" w:sz="8"/>
-            </w:tcBorders>
-            <w:shd w:fill="F3F7FB" w:color="auto" w:val="clear"/>
-            <w:vAlign w:val="center"/>
-          </w:tcPr>
-          <w:p>
-            <w:pPr>
-              <w:jc w:val="center"/>
-            </w:pPr>
-            <w:r>
-              <w:rPr>
-                <w:b/>
-                <w:bCs/>
-                <w:color w:val="5B7FA6"/>
-              </w:rPr>
-              <w:t xml:space="preserve">[ Coller la capture ici ]</w:t>
-            </w:r>
-          </w:p>
-        </w:tc>
-      </w:tr>
-    </w:tbl>
-    <w:p>
-      <w:pPr>
-        <w:spacing w:after="200"/>
-      </w:pPr>
-    </w:p>
-    <w:p>
-      <w:pPr>
-        <w:keepNext/>
-        <w:spacing w:after="80" w:before="160"/>
-      </w:pPr>
-      <w:r>
-        <w:rPr>
-          <w:b/>
-          <w:bCs/>
-          <w:color w:val="1F4E79"/>
-        </w:rPr>
-        <w:t xml:space="preserve">Capture 17 : </w:t>
-      </w:r>
-      <w:r>
-        <w:t xml:space="preserve">Le nom app.pme.lan est maintenant résolu en 192.168.10.4.</w:t>
-      </w:r>
-    </w:p>
-    <w:tbl>
-      <w:tblPr>
-        <w:tblW w:type="dxa" w:w="9638"/>
-        <w:tblBorders>
-          <w:top w:val="single" w:color="auto" w:sz="4"/>
-          <w:left w:val="single" w:color="auto" w:sz="4"/>
-          <w:bottom w:val="single" w:color="auto" w:sz="4"/>
-          <w:right w:val="single" w:color="auto" w:sz="4"/>
-          <w:insideH w:val="single" w:color="auto" w:sz="4"/>
-          <w:insideV w:val="single" w:color="auto" w:sz="4"/>
-        </w:tblBorders>
-      </w:tblPr>
-      <w:tblGrid>
-        <w:gridCol w:w="9638"/>
-      </w:tblGrid>
-      <w:tr>
-        <w:trPr>
-          <w:trHeight w:val="2200" w:hRule="atLeast"/>
-        </w:trPr>
-        <w:tc>
-          <w:tcPr>
-            <w:tcW w:type="dxa" w:w="9638"/>
-            <w:tcBorders>
-              <w:top w:val="dashed" w:color="8EA9C8" w:sz="8"/>
-              <w:left w:val="dashed" w:color="8EA9C8" w:sz="8"/>
-              <w:bottom w:val="dashed" w:color="8EA9C8" w:sz="8"/>
-              <w:right w:val="dashed" w:color="8EA9C8" w:sz="8"/>
-            </w:tcBorders>
-            <w:shd w:fill="F3F7FB" w:color="auto" w:val="clear"/>
-            <w:vAlign w:val="center"/>
-          </w:tcPr>
-          <w:p>
-            <w:pPr>
-              <w:jc w:val="center"/>
-            </w:pPr>
-            <w:r>
-              <w:rPr>
-                <w:b/>
-                <w:bCs/>
-                <w:color w:val="5B7FA6"/>
-              </w:rPr>
-              <w:t xml:space="preserve">[ Coller la capture ici ]</w:t>
-            </w:r>
-          </w:p>
-        </w:tc>
-      </w:tr>
-    </w:tbl>
-    <w:p>
-      <w:pPr>
-        <w:spacing w:after="200"/>
-      </w:pPr>
-    </w:p>
-    <w:p>
-      <w:pPr>
-        <w:keepNext/>
-        <w:spacing w:after="80" w:before="160"/>
-      </w:pPr>
-      <w:r>
-        <w:rPr>
-          <w:b/>
-          <w:bCs/>
-          <w:color w:val="1F4E79"/>
-        </w:rPr>
-        <w:t xml:space="preserve">Capture 18 : </w:t>
-      </w:r>
-      <w:r>
-        <w:t xml:space="preserve">Le script verif.sh montre que le nom interne et Internet fonctionnent.</w:t>
-      </w:r>
-    </w:p>
-    <w:tbl>
-      <w:tblPr>
-        <w:tblW w:type="dxa" w:w="9638"/>
-        <w:tblBorders>
-          <w:top w:val="single" w:color="auto" w:sz="4"/>
-          <w:left w:val="single" w:color="auto" w:sz="4"/>
-          <w:bottom w:val="single" w:color="auto" w:sz="4"/>
-          <w:right w:val="single" w:color="auto" w:sz="4"/>
-          <w:insideH w:val="single" w:color="auto" w:sz="4"/>
-          <w:insideV w:val="single" w:color="auto" w:sz="4"/>
-        </w:tblBorders>
-      </w:tblPr>
-      <w:tblGrid>
-        <w:gridCol w:w="9638"/>
-      </w:tblGrid>
-      <w:tr>
-        <w:trPr>
-          <w:trHeight w:val="2200" w:hRule="atLeast"/>
-        </w:trPr>
-        <w:tc>
-          <w:tcPr>
-            <w:tcW w:type="dxa" w:w="9638"/>
-            <w:tcBorders>
-              <w:top w:val="dashed" w:color="8EA9C8" w:sz="8"/>
-              <w:left w:val="dashed" w:color="8EA9C8" w:sz="8"/>
-              <w:bottom w:val="dashed" w:color="8EA9C8" w:sz="8"/>
-              <w:right w:val="dashed" w:color="8EA9C8" w:sz="8"/>
-            </w:tcBorders>
-            <w:shd w:fill="F3F7FB" w:color="auto" w:val="clear"/>
-            <w:vAlign w:val="center"/>
-          </w:tcPr>
-          <w:p>
-            <w:pPr>
-              <w:jc w:val="center"/>
-            </w:pPr>
-            <w:r>
-              <w:rPr>
-                <w:b/>
-                <w:bCs/>
-                <w:color w:val="5B7FA6"/>
-              </w:rPr>
-              <w:t xml:space="preserve">[ Coller la capture ici ]</w:t>
-            </w:r>
-          </w:p>
-        </w:tc>
-      </w:tr>
-    </w:tbl>
-    <w:p>
-      <w:pPr>
-        <w:spacing w:after="200"/>
-      </w:pPr>
-    </w:p>
-    <w:p>
-      <w:pPr>
-        <w:keepNext/>
-        <w:spacing w:after="80" w:before="160"/>
-      </w:pPr>
-      <w:r>
-        <w:rPr>
-          <w:b/>
-          <w:bCs/>
-          <w:color w:val="1F4E79"/>
-        </w:rPr>
-        <w:t xml:space="preserve">Capture 19 : </w:t>
-      </w:r>
-      <w:r>
-        <w:t xml:space="preserve">Les deux sites s’ouvrent en même temps dans le navigateur.</w:t>
-      </w:r>
-    </w:p>
-    <w:tbl>
-      <w:tblPr>
-        <w:tblW w:type="dxa" w:w="9638"/>
-        <w:tblBorders>
-          <w:top w:val="single" w:color="auto" w:sz="4"/>
-          <w:left w:val="single" w:color="auto" w:sz="4"/>
-          <w:bottom w:val="single" w:color="auto" w:sz="4"/>
-          <w:right w:val="single" w:color="auto" w:sz="4"/>
-          <w:insideH w:val="single" w:color="auto" w:sz="4"/>
-          <w:insideV w:val="single" w:color="auto" w:sz="4"/>
-        </w:tblBorders>
-      </w:tblPr>
-      <w:tblGrid>
-        <w:gridCol w:w="9638"/>
-      </w:tblGrid>
-      <w:tr>
-        <w:trPr>
-          <w:trHeight w:val="2200" w:hRule="atLeast"/>
-        </w:trPr>
-        <w:tc>
-          <w:tcPr>
-            <w:tcW w:type="dxa" w:w="9638"/>
-            <w:tcBorders>
-              <w:top w:val="dashed" w:color="8EA9C8" w:sz="8"/>
-              <w:left w:val="dashed" w:color="8EA9C8" w:sz="8"/>
-              <w:bottom w:val="dashed" w:color="8EA9C8" w:sz="8"/>
-              <w:right w:val="dashed" w:color="8EA9C8" w:sz="8"/>
-            </w:tcBorders>
-            <w:shd w:fill="F3F7FB" w:color="auto" w:val="clear"/>
-            <w:vAlign w:val="center"/>
-          </w:tcPr>
-          <w:p>
-            <w:pPr>
-              <w:jc w:val="center"/>
-            </w:pPr>
-            <w:r>
-              <w:rPr>
-                <w:b/>
-                <w:bCs/>
-                <w:color w:val="5B7FA6"/>
-              </w:rPr>
-              <w:t xml:space="preserve">[ Coller la capture ici ]</w:t>
-            </w:r>
-          </w:p>
-        </w:tc>
-      </w:tr>
-    </w:tbl>
-    <w:p>
-      <w:pPr>
-        <w:spacing w:after="200"/>
-      </w:pPr>
-    </w:p>
-    <w:p>
-      <w:pPr>
-        <w:keepNext/>
-        <w:spacing w:after="80" w:before="160"/>
-      </w:pPr>
-      <w:r>
-        <w:rPr>
-          <w:b/>
-          <w:bCs/>
-          <w:color w:val="1F4E79"/>
-        </w:rPr>
-        <w:t xml:space="preserve">Capture 20 : </w:t>
-      </w:r>
-      <w:r>
-        <w:t xml:space="preserve">Le journal AdGuard montre app.pme.lan « Réécrit » et youtube.com « Traité ».</w:t>
-      </w:r>
-    </w:p>
-    <w:tbl>
-      <w:tblPr>
-        <w:tblW w:type="dxa" w:w="9638"/>
-        <w:tblBorders>
-          <w:top w:val="single" w:color="auto" w:sz="4"/>
-          <w:left w:val="single" w:color="auto" w:sz="4"/>
-          <w:bottom w:val="single" w:color="auto" w:sz="4"/>
-          <w:right w:val="single" w:color="auto" w:sz="4"/>
-          <w:insideH w:val="single" w:color="auto" w:sz="4"/>
-          <w:insideV w:val="single" w:color="auto" w:sz="4"/>
-        </w:tblBorders>
-      </w:tblPr>
-      <w:tblGrid>
-        <w:gridCol w:w="9638"/>
-      </w:tblGrid>
-      <w:tr>
-        <w:trPr>
-          <w:trHeight w:val="2200" w:hRule="atLeast"/>
-        </w:trPr>
-        <w:tc>
-          <w:tcPr>
-            <w:tcW w:type="dxa" w:w="9638"/>
-            <w:tcBorders>
-              <w:top w:val="dashed" w:color="8EA9C8" w:sz="8"/>
-              <w:left w:val="dashed" w:color="8EA9C8" w:sz="8"/>
-              <w:bottom w:val="dashed" w:color="8EA9C8" w:sz="8"/>
-              <w:right w:val="dashed" w:color="8EA9C8" w:sz="8"/>
-            </w:tcBorders>
-            <w:shd w:fill="F3F7FB" w:color="auto" w:val="clear"/>
-            <w:vAlign w:val="center"/>
-          </w:tcPr>
-          <w:p>
-            <w:pPr>
-              <w:jc w:val="center"/>
-            </w:pPr>
-            <w:r>
-              <w:rPr>
-                <w:b/>
-                <w:bCs/>
-                <w:color w:val="5B7FA6"/>
-              </w:rPr>
-              <w:t xml:space="preserve">[ Coller la capture ici ]</w:t>
-            </w:r>
-          </w:p>
-        </w:tc>
-      </w:tr>
-    </w:tbl>
-    <w:p>
-      <w:pPr>
-        <w:spacing w:after="200"/>
-      </w:pPr>
-    </w:p>
-    <w:p>
-      <w:pPr>
-        <w:keepNext/>
-        <w:spacing w:after="80" w:before="160"/>
-      </w:pPr>
-      <w:r>
-        <w:rPr>
-          <w:b/>
-          <w:bCs/>
-          <w:color w:val="1F4E79"/>
-        </w:rPr>
-        <w:t xml:space="preserve">Capture 21 : </w:t>
-      </w:r>
-      <w:r>
-        <w:t xml:space="preserve">Je capture le trajet complet du client avec Wireshark.</w:t>
-      </w:r>
-    </w:p>
-    <w:tbl>
-      <w:tblPr>
-        <w:tblW w:type="dxa" w:w="9638"/>
-        <w:tblBorders>
-          <w:top w:val="single" w:color="auto" w:sz="4"/>
-          <w:left w:val="single" w:color="auto" w:sz="4"/>
-          <w:bottom w:val="single" w:color="auto" w:sz="4"/>
-          <w:right w:val="single" w:color="auto" w:sz="4"/>
-          <w:insideH w:val="single" w:color="auto" w:sz="4"/>
-          <w:insideV w:val="single" w:color="auto" w:sz="4"/>
-        </w:tblBorders>
-      </w:tblPr>
-      <w:tblGrid>
-        <w:gridCol w:w="9638"/>
-      </w:tblGrid>
-      <w:tr>
-        <w:trPr>
-          <w:trHeight w:val="2200" w:hRule="atLeast"/>
-        </w:trPr>
-        <w:tc>
-          <w:tcPr>
-            <w:tcW w:type="dxa" w:w="9638"/>
-            <w:tcBorders>
-              <w:top w:val="dashed" w:color="8EA9C8" w:sz="8"/>
-              <w:left w:val="dashed" w:color="8EA9C8" w:sz="8"/>
-              <w:bottom w:val="dashed" w:color="8EA9C8" w:sz="8"/>
-              <w:right w:val="dashed" w:color="8EA9C8" w:sz="8"/>
-            </w:tcBorders>
-            <w:shd w:fill="F3F7FB" w:color="auto" w:val="clear"/>
-            <w:vAlign w:val="center"/>
-          </w:tcPr>
-          <w:p>
-            <w:pPr>
-              <w:jc w:val="center"/>
-            </w:pPr>
-            <w:r>
-              <w:rPr>
-                <w:b/>
-                <w:bCs/>
-                <w:color w:val="5B7FA6"/>
-              </w:rPr>
-              <w:t xml:space="preserve">[ Coller la capture ici ]</w:t>
-            </w:r>
-          </w:p>
-        </w:tc>
-      </w:tr>
-    </w:tbl>
-    <w:p>
-      <w:pPr>
-        <w:spacing w:after="200"/>
-      </w:pPr>
-    </w:p>
-    <w:p>
-      <w:pPr>
-        <w:keepNext/>
-        <w:spacing w:after="80" w:before="160"/>
-      </w:pPr>
-      <w:r>
-        <w:rPr>
-          <w:b/>
-          <w:bCs/>
-          <w:color w:val="1F4E79"/>
-        </w:rPr>
-        <w:t xml:space="preserve">Capture 22 : </w:t>
-      </w:r>
-      <w:r>
-        <w:t xml:space="preserve">Le client cherche la MAC du serveur web, qui est sur le même réseau.</w:t>
-      </w:r>
-    </w:p>
-    <w:tbl>
-      <w:tblPr>
-        <w:tblW w:type="dxa" w:w="9638"/>
-        <w:tblBorders>
-          <w:top w:val="single" w:color="auto" w:sz="4"/>
-          <w:left w:val="single" w:color="auto" w:sz="4"/>
-          <w:bottom w:val="single" w:color="auto" w:sz="4"/>
-          <w:right w:val="single" w:color="auto" w:sz="4"/>
-          <w:insideH w:val="single" w:color="auto" w:sz="4"/>
-          <w:insideV w:val="single" w:color="auto" w:sz="4"/>
-        </w:tblBorders>
-      </w:tblPr>
-      <w:tblGrid>
-        <w:gridCol w:w="9638"/>
-      </w:tblGrid>
-      <w:tr>
-        <w:trPr>
-          <w:trHeight w:val="2200" w:hRule="atLeast"/>
-        </w:trPr>
-        <w:tc>
-          <w:tcPr>
-            <w:tcW w:type="dxa" w:w="9638"/>
-            <w:tcBorders>
-              <w:top w:val="dashed" w:color="8EA9C8" w:sz="8"/>
-              <w:left w:val="dashed" w:color="8EA9C8" w:sz="8"/>
-              <w:bottom w:val="dashed" w:color="8EA9C8" w:sz="8"/>
-              <w:right w:val="dashed" w:color="8EA9C8" w:sz="8"/>
-            </w:tcBorders>
-            <w:shd w:fill="F3F7FB" w:color="auto" w:val="clear"/>
-            <w:vAlign w:val="center"/>
-          </w:tcPr>
-          <w:p>
-            <w:pPr>
-              <w:jc w:val="center"/>
-            </w:pPr>
-            <w:r>
-              <w:rPr>
-                <w:b/>
-                <w:bCs/>
-                <w:color w:val="5B7FA6"/>
-              </w:rPr>
-              <w:t xml:space="preserve">[ Coller la capture ici ]</w:t>
-            </w:r>
-          </w:p>
-        </w:tc>
-      </w:tr>
-    </w:tbl>
-    <w:p>
-      <w:pPr>
-        <w:spacing w:after="200"/>
-      </w:pPr>
-    </w:p>
-    <w:p>
-      <w:pPr>
-        <w:keepNext/>
-        <w:spacing w:after="80" w:before="160"/>
-      </w:pPr>
-      <w:r>
-        <w:rPr>
-          <w:b/>
-          <w:bCs/>
-          <w:color w:val="1F4E79"/>
-        </w:rPr>
-        <w:t xml:space="preserve">Capture 23 : </w:t>
-      </w:r>
-      <w:r>
-        <w:t xml:space="preserve">Le client cherche la MAC de la passerelle pour joindre Internet.</w:t>
+        <w:t xml:space="preserve">Capture 7 : </w:t>
+      </w:r>
+      <w:r>
+        <w:t xml:space="preserve">Le client reçoit son adresse, sa passerelle et son DNS par DHCP.</w:t>
       </w:r>
     </w:p>
     <w:p>
@@ -2217,9 +1113,9 @@
       <w:r>
         <w:drawing>
           <wp:inline distT="0" distB="0" distL="0" distR="0">
-            <wp:extent cx="5715000" cy="1504950"/>
+            <wp:extent cx="5715000" cy="2447925"/>
             <wp:effectExtent t="0" r="0" b="0" l="0"/>
-            <wp:docPr id="1" name="16.png" descr="Capture d’écran" title="16.png"/>
+            <wp:docPr id="1" name="14.png" descr="Capture d’écran" title="14.png"/>
             <wp:cNvGraphicFramePr>
               <a:graphicFrameLocks xmlns:a="http://schemas.openxmlformats.org/drawingml/2006/main" noChangeAspect="1"/>
             </wp:cNvGraphicFramePr>
@@ -2242,6 +1138,1104 @@
                   <pic:spPr bwMode="auto">
                     <a:xfrm>
                       <a:off x="0" y="0"/>
+                      <a:ext cx="5715000" cy="2447925"/>
+                    </a:xfrm>
+                    <a:prstGeom prst="rect">
+                      <a:avLst/>
+                    </a:prstGeom>
+                  </pic:spPr>
+                </pic:pic>
+              </a:graphicData>
+            </a:graphic>
+          </wp:inline>
+        </w:drawing>
+      </w:r>
+    </w:p>
+    <w:p>
+      <w:pPr>
+        <w:keepNext/>
+        <w:spacing w:after="80" w:before="160"/>
+      </w:pPr>
+      <w:r>
+        <w:rPr>
+          <w:b/>
+          <w:bCs/>
+          <w:color w:val="1F4E79"/>
+        </w:rPr>
+        <w:t xml:space="preserve">Capture 8 : </w:t>
+      </w:r>
+      <w:r>
+        <w:t xml:space="preserve">Je vérifie l’échange DHCP et le bail sur le serveur Kea.</w:t>
+      </w:r>
+    </w:p>
+    <w:tbl>
+      <w:tblPr>
+        <w:tblW w:type="dxa" w:w="9638"/>
+        <w:tblBorders>
+          <w:top w:val="single" w:color="auto" w:sz="4"/>
+          <w:left w:val="single" w:color="auto" w:sz="4"/>
+          <w:bottom w:val="single" w:color="auto" w:sz="4"/>
+          <w:right w:val="single" w:color="auto" w:sz="4"/>
+          <w:insideH w:val="single" w:color="auto" w:sz="4"/>
+          <w:insideV w:val="single" w:color="auto" w:sz="4"/>
+        </w:tblBorders>
+      </w:tblPr>
+      <w:tblGrid>
+        <w:gridCol w:w="9638"/>
+      </w:tblGrid>
+      <w:tr>
+        <w:trPr>
+          <w:trHeight w:val="2200" w:hRule="atLeast"/>
+        </w:trPr>
+        <w:tc>
+          <w:tcPr>
+            <w:tcW w:type="dxa" w:w="9638"/>
+            <w:tcBorders>
+              <w:top w:val="dashed" w:color="8EA9C8" w:sz="8"/>
+              <w:left w:val="dashed" w:color="8EA9C8" w:sz="8"/>
+              <w:bottom w:val="dashed" w:color="8EA9C8" w:sz="8"/>
+              <w:right w:val="dashed" w:color="8EA9C8" w:sz="8"/>
+            </w:tcBorders>
+            <w:shd w:fill="F3F7FB" w:color="auto" w:val="clear"/>
+            <w:vAlign w:val="center"/>
+          </w:tcPr>
+          <w:p>
+            <w:pPr>
+              <w:jc w:val="center"/>
+            </w:pPr>
+            <w:r>
+              <w:rPr>
+                <w:b/>
+                <w:bCs/>
+                <w:color w:val="5B7FA6"/>
+              </w:rPr>
+              <w:t xml:space="preserve">[ Coller la capture ici ]</w:t>
+            </w:r>
+          </w:p>
+        </w:tc>
+      </w:tr>
+    </w:tbl>
+    <w:p>
+      <w:pPr>
+        <w:spacing w:after="200"/>
+      </w:pPr>
+    </w:p>
+    <w:p>
+      <w:pPr>
+        <w:keepNext/>
+        <w:spacing w:after="80" w:before="160"/>
+      </w:pPr>
+      <w:r>
+        <w:rPr>
+          <w:b/>
+          <w:bCs/>
+          <w:color w:val="1F4E79"/>
+        </w:rPr>
+        <w:t xml:space="preserve">Capture 9 : </w:t>
+      </w:r>
+      <w:r>
+        <w:t xml:space="preserve">Je vérifie qu’un seul serveur DHCP répond sur le réseau.</w:t>
+      </w:r>
+    </w:p>
+    <w:tbl>
+      <w:tblPr>
+        <w:tblW w:type="dxa" w:w="9638"/>
+        <w:tblBorders>
+          <w:top w:val="single" w:color="auto" w:sz="4"/>
+          <w:left w:val="single" w:color="auto" w:sz="4"/>
+          <w:bottom w:val="single" w:color="auto" w:sz="4"/>
+          <w:right w:val="single" w:color="auto" w:sz="4"/>
+          <w:insideH w:val="single" w:color="auto" w:sz="4"/>
+          <w:insideV w:val="single" w:color="auto" w:sz="4"/>
+        </w:tblBorders>
+      </w:tblPr>
+      <w:tblGrid>
+        <w:gridCol w:w="9638"/>
+      </w:tblGrid>
+      <w:tr>
+        <w:trPr>
+          <w:trHeight w:val="2200" w:hRule="atLeast"/>
+        </w:trPr>
+        <w:tc>
+          <w:tcPr>
+            <w:tcW w:type="dxa" w:w="9638"/>
+            <w:tcBorders>
+              <w:top w:val="dashed" w:color="8EA9C8" w:sz="8"/>
+              <w:left w:val="dashed" w:color="8EA9C8" w:sz="8"/>
+              <w:bottom w:val="dashed" w:color="8EA9C8" w:sz="8"/>
+              <w:right w:val="dashed" w:color="8EA9C8" w:sz="8"/>
+            </w:tcBorders>
+            <w:shd w:fill="F3F7FB" w:color="auto" w:val="clear"/>
+            <w:vAlign w:val="center"/>
+          </w:tcPr>
+          <w:p>
+            <w:pPr>
+              <w:jc w:val="center"/>
+            </w:pPr>
+            <w:r>
+              <w:rPr>
+                <w:b/>
+                <w:bCs/>
+                <w:color w:val="5B7FA6"/>
+              </w:rPr>
+              <w:t xml:space="preserve">[ Coller la capture ici ]</w:t>
+            </w:r>
+          </w:p>
+        </w:tc>
+      </w:tr>
+    </w:tbl>
+    <w:p>
+      <w:pPr>
+        <w:spacing w:after="200"/>
+      </w:pPr>
+    </w:p>
+    <w:p>
+      <w:pPr>
+        <w:keepNext/>
+        <w:spacing w:after="80" w:before="160"/>
+      </w:pPr>
+      <w:r>
+        <w:rPr>
+          <w:b/>
+          <w:bCs/>
+          <w:color w:val="1F4E79"/>
+        </w:rPr>
+        <w:t xml:space="preserve">Capture 10 : </w:t>
+      </w:r>
+      <w:r>
+        <w:t xml:space="preserve">Je vérifie que c’est AdGuard (192.168.10.3) qui répond aux requêtes DNS.</w:t>
+      </w:r>
+    </w:p>
+    <w:tbl>
+      <w:tblPr>
+        <w:tblW w:type="dxa" w:w="9638"/>
+        <w:tblBorders>
+          <w:top w:val="single" w:color="auto" w:sz="4"/>
+          <w:left w:val="single" w:color="auto" w:sz="4"/>
+          <w:bottom w:val="single" w:color="auto" w:sz="4"/>
+          <w:right w:val="single" w:color="auto" w:sz="4"/>
+          <w:insideH w:val="single" w:color="auto" w:sz="4"/>
+          <w:insideV w:val="single" w:color="auto" w:sz="4"/>
+        </w:tblBorders>
+      </w:tblPr>
+      <w:tblGrid>
+        <w:gridCol w:w="9638"/>
+      </w:tblGrid>
+      <w:tr>
+        <w:trPr>
+          <w:trHeight w:val="2200" w:hRule="atLeast"/>
+        </w:trPr>
+        <w:tc>
+          <w:tcPr>
+            <w:tcW w:type="dxa" w:w="9638"/>
+            <w:tcBorders>
+              <w:top w:val="dashed" w:color="8EA9C8" w:sz="8"/>
+              <w:left w:val="dashed" w:color="8EA9C8" w:sz="8"/>
+              <w:bottom w:val="dashed" w:color="8EA9C8" w:sz="8"/>
+              <w:right w:val="dashed" w:color="8EA9C8" w:sz="8"/>
+            </w:tcBorders>
+            <w:shd w:fill="F3F7FB" w:color="auto" w:val="clear"/>
+            <w:vAlign w:val="center"/>
+          </w:tcPr>
+          <w:p>
+            <w:pPr>
+              <w:jc w:val="center"/>
+            </w:pPr>
+            <w:r>
+              <w:rPr>
+                <w:b/>
+                <w:bCs/>
+                <w:color w:val="5B7FA6"/>
+              </w:rPr>
+              <w:t xml:space="preserve">[ Coller la capture ici ]</w:t>
+            </w:r>
+          </w:p>
+        </w:tc>
+      </w:tr>
+    </w:tbl>
+    <w:p>
+      <w:pPr>
+        <w:spacing w:after="200"/>
+      </w:pPr>
+    </w:p>
+    <w:p>
+      <w:pPr>
+        <w:keepNext/>
+        <w:spacing w:after="80" w:before="160"/>
+      </w:pPr>
+      <w:r>
+        <w:rPr>
+          <w:b/>
+          <w:bCs/>
+          <w:color w:val="1F4E79"/>
+        </w:rPr>
+        <w:t xml:space="preserve">Capture 11 : </w:t>
+      </w:r>
+      <w:r>
+        <w:t xml:space="preserve">Le client navigue sur Internet (YouTube).</w:t>
+      </w:r>
+    </w:p>
+    <w:tbl>
+      <w:tblPr>
+        <w:tblW w:type="dxa" w:w="9638"/>
+        <w:tblBorders>
+          <w:top w:val="single" w:color="auto" w:sz="4"/>
+          <w:left w:val="single" w:color="auto" w:sz="4"/>
+          <w:bottom w:val="single" w:color="auto" w:sz="4"/>
+          <w:right w:val="single" w:color="auto" w:sz="4"/>
+          <w:insideH w:val="single" w:color="auto" w:sz="4"/>
+          <w:insideV w:val="single" w:color="auto" w:sz="4"/>
+        </w:tblBorders>
+      </w:tblPr>
+      <w:tblGrid>
+        <w:gridCol w:w="9638"/>
+      </w:tblGrid>
+      <w:tr>
+        <w:trPr>
+          <w:trHeight w:val="2200" w:hRule="atLeast"/>
+        </w:trPr>
+        <w:tc>
+          <w:tcPr>
+            <w:tcW w:type="dxa" w:w="9638"/>
+            <w:tcBorders>
+              <w:top w:val="dashed" w:color="8EA9C8" w:sz="8"/>
+              <w:left w:val="dashed" w:color="8EA9C8" w:sz="8"/>
+              <w:bottom w:val="dashed" w:color="8EA9C8" w:sz="8"/>
+              <w:right w:val="dashed" w:color="8EA9C8" w:sz="8"/>
+            </w:tcBorders>
+            <w:shd w:fill="F3F7FB" w:color="auto" w:val="clear"/>
+            <w:vAlign w:val="center"/>
+          </w:tcPr>
+          <w:p>
+            <w:pPr>
+              <w:jc w:val="center"/>
+            </w:pPr>
+            <w:r>
+              <w:rPr>
+                <w:b/>
+                <w:bCs/>
+                <w:color w:val="5B7FA6"/>
+              </w:rPr>
+              <w:t xml:space="preserve">[ Coller la capture ici ]</w:t>
+            </w:r>
+          </w:p>
+        </w:tc>
+      </w:tr>
+    </w:tbl>
+    <w:p>
+      <w:pPr>
+        <w:spacing w:after="200"/>
+      </w:pPr>
+    </w:p>
+    <w:p>
+      <w:pPr>
+        <w:keepNext/>
+        <w:spacing w:after="80" w:before="160"/>
+      </w:pPr>
+      <w:r>
+        <w:rPr>
+          <w:b/>
+          <w:bCs/>
+          <w:color w:val="1F4E79"/>
+        </w:rPr>
+        <w:t xml:space="preserve">Capture 12 : </w:t>
+      </w:r>
+      <w:r>
+        <w:t xml:space="preserve">La requête youtube.com apparaît dans le journal d’AdGuard.</w:t>
+      </w:r>
+    </w:p>
+    <w:tbl>
+      <w:tblPr>
+        <w:tblW w:type="dxa" w:w="9638"/>
+        <w:tblBorders>
+          <w:top w:val="single" w:color="auto" w:sz="4"/>
+          <w:left w:val="single" w:color="auto" w:sz="4"/>
+          <w:bottom w:val="single" w:color="auto" w:sz="4"/>
+          <w:right w:val="single" w:color="auto" w:sz="4"/>
+          <w:insideH w:val="single" w:color="auto" w:sz="4"/>
+          <w:insideV w:val="single" w:color="auto" w:sz="4"/>
+        </w:tblBorders>
+      </w:tblPr>
+      <w:tblGrid>
+        <w:gridCol w:w="9638"/>
+      </w:tblGrid>
+      <w:tr>
+        <w:trPr>
+          <w:trHeight w:val="2200" w:hRule="atLeast"/>
+        </w:trPr>
+        <w:tc>
+          <w:tcPr>
+            <w:tcW w:type="dxa" w:w="9638"/>
+            <w:tcBorders>
+              <w:top w:val="dashed" w:color="8EA9C8" w:sz="8"/>
+              <w:left w:val="dashed" w:color="8EA9C8" w:sz="8"/>
+              <w:bottom w:val="dashed" w:color="8EA9C8" w:sz="8"/>
+              <w:right w:val="dashed" w:color="8EA9C8" w:sz="8"/>
+            </w:tcBorders>
+            <w:shd w:fill="F3F7FB" w:color="auto" w:val="clear"/>
+            <w:vAlign w:val="center"/>
+          </w:tcPr>
+          <w:p>
+            <w:pPr>
+              <w:jc w:val="center"/>
+            </w:pPr>
+            <w:r>
+              <w:rPr>
+                <w:b/>
+                <w:bCs/>
+                <w:color w:val="5B7FA6"/>
+              </w:rPr>
+              <w:t xml:space="preserve">[ Coller la capture ici ]</w:t>
+            </w:r>
+          </w:p>
+        </w:tc>
+      </w:tr>
+    </w:tbl>
+    <w:p>
+      <w:pPr>
+        <w:spacing w:after="200"/>
+      </w:pPr>
+    </w:p>
+    <w:p>
+      <w:pPr>
+        <w:keepNext/>
+        <w:spacing w:after="80" w:before="160"/>
+      </w:pPr>
+      <w:r>
+        <w:rPr>
+          <w:b/>
+          <w:bCs/>
+          <w:color w:val="1F4E79"/>
+        </w:rPr>
+        <w:t xml:space="preserve">Capture 13 : </w:t>
+      </w:r>
+      <w:r>
+        <w:t xml:space="preserve">Je vérifie qu’Apache tourne sur srv-web.</w:t>
+      </w:r>
+    </w:p>
+    <w:tbl>
+      <w:tblPr>
+        <w:tblW w:type="dxa" w:w="9638"/>
+        <w:tblBorders>
+          <w:top w:val="single" w:color="auto" w:sz="4"/>
+          <w:left w:val="single" w:color="auto" w:sz="4"/>
+          <w:bottom w:val="single" w:color="auto" w:sz="4"/>
+          <w:right w:val="single" w:color="auto" w:sz="4"/>
+          <w:insideH w:val="single" w:color="auto" w:sz="4"/>
+          <w:insideV w:val="single" w:color="auto" w:sz="4"/>
+        </w:tblBorders>
+      </w:tblPr>
+      <w:tblGrid>
+        <w:gridCol w:w="9638"/>
+      </w:tblGrid>
+      <w:tr>
+        <w:trPr>
+          <w:trHeight w:val="2200" w:hRule="atLeast"/>
+        </w:trPr>
+        <w:tc>
+          <w:tcPr>
+            <w:tcW w:type="dxa" w:w="9638"/>
+            <w:tcBorders>
+              <w:top w:val="dashed" w:color="8EA9C8" w:sz="8"/>
+              <w:left w:val="dashed" w:color="8EA9C8" w:sz="8"/>
+              <w:bottom w:val="dashed" w:color="8EA9C8" w:sz="8"/>
+              <w:right w:val="dashed" w:color="8EA9C8" w:sz="8"/>
+            </w:tcBorders>
+            <w:shd w:fill="F3F7FB" w:color="auto" w:val="clear"/>
+            <w:vAlign w:val="center"/>
+          </w:tcPr>
+          <w:p>
+            <w:pPr>
+              <w:jc w:val="center"/>
+            </w:pPr>
+            <w:r>
+              <w:rPr>
+                <w:b/>
+                <w:bCs/>
+                <w:color w:val="5B7FA6"/>
+              </w:rPr>
+              <w:t xml:space="preserve">[ Coller la capture ici ]</w:t>
+            </w:r>
+          </w:p>
+        </w:tc>
+      </w:tr>
+    </w:tbl>
+    <w:p>
+      <w:pPr>
+        <w:spacing w:after="200"/>
+      </w:pPr>
+    </w:p>
+    <w:p>
+      <w:pPr>
+        <w:keepNext/>
+        <w:spacing w:after="80" w:before="160"/>
+      </w:pPr>
+      <w:r>
+        <w:rPr>
+          <w:b/>
+          <w:bCs/>
+          <w:color w:val="1F4E79"/>
+        </w:rPr>
+        <w:t xml:space="preserve">Capture 14 : </w:t>
+      </w:r>
+      <w:r>
+        <w:t xml:space="preserve">La page web s’ouvre avec l’adresse IP du serveur.</w:t>
+      </w:r>
+    </w:p>
+    <w:tbl>
+      <w:tblPr>
+        <w:tblW w:type="dxa" w:w="9638"/>
+        <w:tblBorders>
+          <w:top w:val="single" w:color="auto" w:sz="4"/>
+          <w:left w:val="single" w:color="auto" w:sz="4"/>
+          <w:bottom w:val="single" w:color="auto" w:sz="4"/>
+          <w:right w:val="single" w:color="auto" w:sz="4"/>
+          <w:insideH w:val="single" w:color="auto" w:sz="4"/>
+          <w:insideV w:val="single" w:color="auto" w:sz="4"/>
+        </w:tblBorders>
+      </w:tblPr>
+      <w:tblGrid>
+        <w:gridCol w:w="9638"/>
+      </w:tblGrid>
+      <w:tr>
+        <w:trPr>
+          <w:trHeight w:val="2200" w:hRule="atLeast"/>
+        </w:trPr>
+        <w:tc>
+          <w:tcPr>
+            <w:tcW w:type="dxa" w:w="9638"/>
+            <w:tcBorders>
+              <w:top w:val="dashed" w:color="8EA9C8" w:sz="8"/>
+              <w:left w:val="dashed" w:color="8EA9C8" w:sz="8"/>
+              <w:bottom w:val="dashed" w:color="8EA9C8" w:sz="8"/>
+              <w:right w:val="dashed" w:color="8EA9C8" w:sz="8"/>
+            </w:tcBorders>
+            <w:shd w:fill="F3F7FB" w:color="auto" w:val="clear"/>
+            <w:vAlign w:val="center"/>
+          </w:tcPr>
+          <w:p>
+            <w:pPr>
+              <w:jc w:val="center"/>
+            </w:pPr>
+            <w:r>
+              <w:rPr>
+                <w:b/>
+                <w:bCs/>
+                <w:color w:val="5B7FA6"/>
+              </w:rPr>
+              <w:t xml:space="preserve">[ Coller la capture ici ]</w:t>
+            </w:r>
+          </w:p>
+        </w:tc>
+      </w:tr>
+    </w:tbl>
+    <w:p>
+      <w:pPr>
+        <w:spacing w:after="200"/>
+      </w:pPr>
+    </w:p>
+    <w:p>
+      <w:pPr>
+        <w:keepNext/>
+        <w:spacing w:after="80" w:before="160"/>
+      </w:pPr>
+      <w:r>
+        <w:rPr>
+          <w:b/>
+          <w:bCs/>
+          <w:color w:val="1F4E79"/>
+        </w:rPr>
+        <w:t xml:space="preserve">Capture 15 : </w:t>
+      </w:r>
+      <w:r>
+        <w:t xml:space="preserve">Avant la réécriture, le nom app.pme.lan n’existe pas.</w:t>
+      </w:r>
+    </w:p>
+    <w:tbl>
+      <w:tblPr>
+        <w:tblW w:type="dxa" w:w="9638"/>
+        <w:tblBorders>
+          <w:top w:val="single" w:color="auto" w:sz="4"/>
+          <w:left w:val="single" w:color="auto" w:sz="4"/>
+          <w:bottom w:val="single" w:color="auto" w:sz="4"/>
+          <w:right w:val="single" w:color="auto" w:sz="4"/>
+          <w:insideH w:val="single" w:color="auto" w:sz="4"/>
+          <w:insideV w:val="single" w:color="auto" w:sz="4"/>
+        </w:tblBorders>
+      </w:tblPr>
+      <w:tblGrid>
+        <w:gridCol w:w="9638"/>
+      </w:tblGrid>
+      <w:tr>
+        <w:trPr>
+          <w:trHeight w:val="2200" w:hRule="atLeast"/>
+        </w:trPr>
+        <w:tc>
+          <w:tcPr>
+            <w:tcW w:type="dxa" w:w="9638"/>
+            <w:tcBorders>
+              <w:top w:val="dashed" w:color="8EA9C8" w:sz="8"/>
+              <w:left w:val="dashed" w:color="8EA9C8" w:sz="8"/>
+              <w:bottom w:val="dashed" w:color="8EA9C8" w:sz="8"/>
+              <w:right w:val="dashed" w:color="8EA9C8" w:sz="8"/>
+            </w:tcBorders>
+            <w:shd w:fill="F3F7FB" w:color="auto" w:val="clear"/>
+            <w:vAlign w:val="center"/>
+          </w:tcPr>
+          <w:p>
+            <w:pPr>
+              <w:jc w:val="center"/>
+            </w:pPr>
+            <w:r>
+              <w:rPr>
+                <w:b/>
+                <w:bCs/>
+                <w:color w:val="5B7FA6"/>
+              </w:rPr>
+              <w:t xml:space="preserve">[ Coller la capture ici ]</w:t>
+            </w:r>
+          </w:p>
+        </w:tc>
+      </w:tr>
+    </w:tbl>
+    <w:p>
+      <w:pPr>
+        <w:spacing w:after="200"/>
+      </w:pPr>
+    </w:p>
+    <w:p>
+      <w:pPr>
+        <w:keepNext/>
+        <w:spacing w:after="80" w:before="160"/>
+      </w:pPr>
+      <w:r>
+        <w:rPr>
+          <w:b/>
+          <w:bCs/>
+          <w:color w:val="1F4E79"/>
+        </w:rPr>
+        <w:t xml:space="preserve">Capture 16 : </w:t>
+      </w:r>
+      <w:r>
+        <w:t xml:space="preserve">J’ajoute la réécriture app.pme.lan vers 192.168.10.4 dans AdGuard.</w:t>
+      </w:r>
+    </w:p>
+    <w:tbl>
+      <w:tblPr>
+        <w:tblW w:type="dxa" w:w="9638"/>
+        <w:tblBorders>
+          <w:top w:val="single" w:color="auto" w:sz="4"/>
+          <w:left w:val="single" w:color="auto" w:sz="4"/>
+          <w:bottom w:val="single" w:color="auto" w:sz="4"/>
+          <w:right w:val="single" w:color="auto" w:sz="4"/>
+          <w:insideH w:val="single" w:color="auto" w:sz="4"/>
+          <w:insideV w:val="single" w:color="auto" w:sz="4"/>
+        </w:tblBorders>
+      </w:tblPr>
+      <w:tblGrid>
+        <w:gridCol w:w="9638"/>
+      </w:tblGrid>
+      <w:tr>
+        <w:trPr>
+          <w:trHeight w:val="2200" w:hRule="atLeast"/>
+        </w:trPr>
+        <w:tc>
+          <w:tcPr>
+            <w:tcW w:type="dxa" w:w="9638"/>
+            <w:tcBorders>
+              <w:top w:val="dashed" w:color="8EA9C8" w:sz="8"/>
+              <w:left w:val="dashed" w:color="8EA9C8" w:sz="8"/>
+              <w:bottom w:val="dashed" w:color="8EA9C8" w:sz="8"/>
+              <w:right w:val="dashed" w:color="8EA9C8" w:sz="8"/>
+            </w:tcBorders>
+            <w:shd w:fill="F3F7FB" w:color="auto" w:val="clear"/>
+            <w:vAlign w:val="center"/>
+          </w:tcPr>
+          <w:p>
+            <w:pPr>
+              <w:jc w:val="center"/>
+            </w:pPr>
+            <w:r>
+              <w:rPr>
+                <w:b/>
+                <w:bCs/>
+                <w:color w:val="5B7FA6"/>
+              </w:rPr>
+              <w:t xml:space="preserve">[ Coller la capture ici ]</w:t>
+            </w:r>
+          </w:p>
+        </w:tc>
+      </w:tr>
+    </w:tbl>
+    <w:p>
+      <w:pPr>
+        <w:spacing w:after="200"/>
+      </w:pPr>
+    </w:p>
+    <w:p>
+      <w:pPr>
+        <w:keepNext/>
+        <w:spacing w:after="80" w:before="160"/>
+      </w:pPr>
+      <w:r>
+        <w:rPr>
+          <w:b/>
+          <w:bCs/>
+          <w:color w:val="1F4E79"/>
+        </w:rPr>
+        <w:t xml:space="preserve">Capture 17 : </w:t>
+      </w:r>
+      <w:r>
+        <w:t xml:space="preserve">Le nom app.pme.lan est maintenant résolu en 192.168.10.4.</w:t>
+      </w:r>
+    </w:p>
+    <w:tbl>
+      <w:tblPr>
+        <w:tblW w:type="dxa" w:w="9638"/>
+        <w:tblBorders>
+          <w:top w:val="single" w:color="auto" w:sz="4"/>
+          <w:left w:val="single" w:color="auto" w:sz="4"/>
+          <w:bottom w:val="single" w:color="auto" w:sz="4"/>
+          <w:right w:val="single" w:color="auto" w:sz="4"/>
+          <w:insideH w:val="single" w:color="auto" w:sz="4"/>
+          <w:insideV w:val="single" w:color="auto" w:sz="4"/>
+        </w:tblBorders>
+      </w:tblPr>
+      <w:tblGrid>
+        <w:gridCol w:w="9638"/>
+      </w:tblGrid>
+      <w:tr>
+        <w:trPr>
+          <w:trHeight w:val="2200" w:hRule="atLeast"/>
+        </w:trPr>
+        <w:tc>
+          <w:tcPr>
+            <w:tcW w:type="dxa" w:w="9638"/>
+            <w:tcBorders>
+              <w:top w:val="dashed" w:color="8EA9C8" w:sz="8"/>
+              <w:left w:val="dashed" w:color="8EA9C8" w:sz="8"/>
+              <w:bottom w:val="dashed" w:color="8EA9C8" w:sz="8"/>
+              <w:right w:val="dashed" w:color="8EA9C8" w:sz="8"/>
+            </w:tcBorders>
+            <w:shd w:fill="F3F7FB" w:color="auto" w:val="clear"/>
+            <w:vAlign w:val="center"/>
+          </w:tcPr>
+          <w:p>
+            <w:pPr>
+              <w:jc w:val="center"/>
+            </w:pPr>
+            <w:r>
+              <w:rPr>
+                <w:b/>
+                <w:bCs/>
+                <w:color w:val="5B7FA6"/>
+              </w:rPr>
+              <w:t xml:space="preserve">[ Coller la capture ici ]</w:t>
+            </w:r>
+          </w:p>
+        </w:tc>
+      </w:tr>
+    </w:tbl>
+    <w:p>
+      <w:pPr>
+        <w:spacing w:after="200"/>
+      </w:pPr>
+    </w:p>
+    <w:p>
+      <w:pPr>
+        <w:keepNext/>
+        <w:spacing w:after="80" w:before="160"/>
+      </w:pPr>
+      <w:r>
+        <w:rPr>
+          <w:b/>
+          <w:bCs/>
+          <w:color w:val="1F4E79"/>
+        </w:rPr>
+        <w:t xml:space="preserve">Capture 18 : </w:t>
+      </w:r>
+      <w:r>
+        <w:t xml:space="preserve">Le script verif.sh montre que le nom interne et Internet fonctionnent.</w:t>
+      </w:r>
+    </w:p>
+    <w:tbl>
+      <w:tblPr>
+        <w:tblW w:type="dxa" w:w="9638"/>
+        <w:tblBorders>
+          <w:top w:val="single" w:color="auto" w:sz="4"/>
+          <w:left w:val="single" w:color="auto" w:sz="4"/>
+          <w:bottom w:val="single" w:color="auto" w:sz="4"/>
+          <w:right w:val="single" w:color="auto" w:sz="4"/>
+          <w:insideH w:val="single" w:color="auto" w:sz="4"/>
+          <w:insideV w:val="single" w:color="auto" w:sz="4"/>
+        </w:tblBorders>
+      </w:tblPr>
+      <w:tblGrid>
+        <w:gridCol w:w="9638"/>
+      </w:tblGrid>
+      <w:tr>
+        <w:trPr>
+          <w:trHeight w:val="2200" w:hRule="atLeast"/>
+        </w:trPr>
+        <w:tc>
+          <w:tcPr>
+            <w:tcW w:type="dxa" w:w="9638"/>
+            <w:tcBorders>
+              <w:top w:val="dashed" w:color="8EA9C8" w:sz="8"/>
+              <w:left w:val="dashed" w:color="8EA9C8" w:sz="8"/>
+              <w:bottom w:val="dashed" w:color="8EA9C8" w:sz="8"/>
+              <w:right w:val="dashed" w:color="8EA9C8" w:sz="8"/>
+            </w:tcBorders>
+            <w:shd w:fill="F3F7FB" w:color="auto" w:val="clear"/>
+            <w:vAlign w:val="center"/>
+          </w:tcPr>
+          <w:p>
+            <w:pPr>
+              <w:jc w:val="center"/>
+            </w:pPr>
+            <w:r>
+              <w:rPr>
+                <w:b/>
+                <w:bCs/>
+                <w:color w:val="5B7FA6"/>
+              </w:rPr>
+              <w:t xml:space="preserve">[ Coller la capture ici ]</w:t>
+            </w:r>
+          </w:p>
+        </w:tc>
+      </w:tr>
+    </w:tbl>
+    <w:p>
+      <w:pPr>
+        <w:spacing w:after="200"/>
+      </w:pPr>
+    </w:p>
+    <w:p>
+      <w:pPr>
+        <w:keepNext/>
+        <w:spacing w:after="80" w:before="160"/>
+      </w:pPr>
+      <w:r>
+        <w:rPr>
+          <w:b/>
+          <w:bCs/>
+          <w:color w:val="1F4E79"/>
+        </w:rPr>
+        <w:t xml:space="preserve">Capture 19 : </w:t>
+      </w:r>
+      <w:r>
+        <w:t xml:space="preserve">Les deux sites s’ouvrent en même temps dans le navigateur.</w:t>
+      </w:r>
+    </w:p>
+    <w:tbl>
+      <w:tblPr>
+        <w:tblW w:type="dxa" w:w="9638"/>
+        <w:tblBorders>
+          <w:top w:val="single" w:color="auto" w:sz="4"/>
+          <w:left w:val="single" w:color="auto" w:sz="4"/>
+          <w:bottom w:val="single" w:color="auto" w:sz="4"/>
+          <w:right w:val="single" w:color="auto" w:sz="4"/>
+          <w:insideH w:val="single" w:color="auto" w:sz="4"/>
+          <w:insideV w:val="single" w:color="auto" w:sz="4"/>
+        </w:tblBorders>
+      </w:tblPr>
+      <w:tblGrid>
+        <w:gridCol w:w="9638"/>
+      </w:tblGrid>
+      <w:tr>
+        <w:trPr>
+          <w:trHeight w:val="2200" w:hRule="atLeast"/>
+        </w:trPr>
+        <w:tc>
+          <w:tcPr>
+            <w:tcW w:type="dxa" w:w="9638"/>
+            <w:tcBorders>
+              <w:top w:val="dashed" w:color="8EA9C8" w:sz="8"/>
+              <w:left w:val="dashed" w:color="8EA9C8" w:sz="8"/>
+              <w:bottom w:val="dashed" w:color="8EA9C8" w:sz="8"/>
+              <w:right w:val="dashed" w:color="8EA9C8" w:sz="8"/>
+            </w:tcBorders>
+            <w:shd w:fill="F3F7FB" w:color="auto" w:val="clear"/>
+            <w:vAlign w:val="center"/>
+          </w:tcPr>
+          <w:p>
+            <w:pPr>
+              <w:jc w:val="center"/>
+            </w:pPr>
+            <w:r>
+              <w:rPr>
+                <w:b/>
+                <w:bCs/>
+                <w:color w:val="5B7FA6"/>
+              </w:rPr>
+              <w:t xml:space="preserve">[ Coller la capture ici ]</w:t>
+            </w:r>
+          </w:p>
+        </w:tc>
+      </w:tr>
+    </w:tbl>
+    <w:p>
+      <w:pPr>
+        <w:spacing w:after="200"/>
+      </w:pPr>
+    </w:p>
+    <w:p>
+      <w:pPr>
+        <w:keepNext/>
+        <w:spacing w:after="80" w:before="160"/>
+      </w:pPr>
+      <w:r>
+        <w:rPr>
+          <w:b/>
+          <w:bCs/>
+          <w:color w:val="1F4E79"/>
+        </w:rPr>
+        <w:t xml:space="preserve">Capture 20 : </w:t>
+      </w:r>
+      <w:r>
+        <w:t xml:space="preserve">Le journal AdGuard montre app.pme.lan « Réécrit » et youtube.com « Traité ».</w:t>
+      </w:r>
+    </w:p>
+    <w:tbl>
+      <w:tblPr>
+        <w:tblW w:type="dxa" w:w="9638"/>
+        <w:tblBorders>
+          <w:top w:val="single" w:color="auto" w:sz="4"/>
+          <w:left w:val="single" w:color="auto" w:sz="4"/>
+          <w:bottom w:val="single" w:color="auto" w:sz="4"/>
+          <w:right w:val="single" w:color="auto" w:sz="4"/>
+          <w:insideH w:val="single" w:color="auto" w:sz="4"/>
+          <w:insideV w:val="single" w:color="auto" w:sz="4"/>
+        </w:tblBorders>
+      </w:tblPr>
+      <w:tblGrid>
+        <w:gridCol w:w="9638"/>
+      </w:tblGrid>
+      <w:tr>
+        <w:trPr>
+          <w:trHeight w:val="2200" w:hRule="atLeast"/>
+        </w:trPr>
+        <w:tc>
+          <w:tcPr>
+            <w:tcW w:type="dxa" w:w="9638"/>
+            <w:tcBorders>
+              <w:top w:val="dashed" w:color="8EA9C8" w:sz="8"/>
+              <w:left w:val="dashed" w:color="8EA9C8" w:sz="8"/>
+              <w:bottom w:val="dashed" w:color="8EA9C8" w:sz="8"/>
+              <w:right w:val="dashed" w:color="8EA9C8" w:sz="8"/>
+            </w:tcBorders>
+            <w:shd w:fill="F3F7FB" w:color="auto" w:val="clear"/>
+            <w:vAlign w:val="center"/>
+          </w:tcPr>
+          <w:p>
+            <w:pPr>
+              <w:jc w:val="center"/>
+            </w:pPr>
+            <w:r>
+              <w:rPr>
+                <w:b/>
+                <w:bCs/>
+                <w:color w:val="5B7FA6"/>
+              </w:rPr>
+              <w:t xml:space="preserve">[ Coller la capture ici ]</w:t>
+            </w:r>
+          </w:p>
+        </w:tc>
+      </w:tr>
+    </w:tbl>
+    <w:p>
+      <w:pPr>
+        <w:spacing w:after="200"/>
+      </w:pPr>
+    </w:p>
+    <w:p>
+      <w:pPr>
+        <w:keepNext/>
+        <w:spacing w:after="80" w:before="160"/>
+      </w:pPr>
+      <w:r>
+        <w:rPr>
+          <w:b/>
+          <w:bCs/>
+          <w:color w:val="1F4E79"/>
+        </w:rPr>
+        <w:t xml:space="preserve">Capture 21 : </w:t>
+      </w:r>
+      <w:r>
+        <w:t xml:space="preserve">Je capture le trajet complet du client avec Wireshark.</w:t>
+      </w:r>
+    </w:p>
+    <w:tbl>
+      <w:tblPr>
+        <w:tblW w:type="dxa" w:w="9638"/>
+        <w:tblBorders>
+          <w:top w:val="single" w:color="auto" w:sz="4"/>
+          <w:left w:val="single" w:color="auto" w:sz="4"/>
+          <w:bottom w:val="single" w:color="auto" w:sz="4"/>
+          <w:right w:val="single" w:color="auto" w:sz="4"/>
+          <w:insideH w:val="single" w:color="auto" w:sz="4"/>
+          <w:insideV w:val="single" w:color="auto" w:sz="4"/>
+        </w:tblBorders>
+      </w:tblPr>
+      <w:tblGrid>
+        <w:gridCol w:w="9638"/>
+      </w:tblGrid>
+      <w:tr>
+        <w:trPr>
+          <w:trHeight w:val="2200" w:hRule="atLeast"/>
+        </w:trPr>
+        <w:tc>
+          <w:tcPr>
+            <w:tcW w:type="dxa" w:w="9638"/>
+            <w:tcBorders>
+              <w:top w:val="dashed" w:color="8EA9C8" w:sz="8"/>
+              <w:left w:val="dashed" w:color="8EA9C8" w:sz="8"/>
+              <w:bottom w:val="dashed" w:color="8EA9C8" w:sz="8"/>
+              <w:right w:val="dashed" w:color="8EA9C8" w:sz="8"/>
+            </w:tcBorders>
+            <w:shd w:fill="F3F7FB" w:color="auto" w:val="clear"/>
+            <w:vAlign w:val="center"/>
+          </w:tcPr>
+          <w:p>
+            <w:pPr>
+              <w:jc w:val="center"/>
+            </w:pPr>
+            <w:r>
+              <w:rPr>
+                <w:b/>
+                <w:bCs/>
+                <w:color w:val="5B7FA6"/>
+              </w:rPr>
+              <w:t xml:space="preserve">[ Coller la capture ici ]</w:t>
+            </w:r>
+          </w:p>
+        </w:tc>
+      </w:tr>
+    </w:tbl>
+    <w:p>
+      <w:pPr>
+        <w:spacing w:after="200"/>
+      </w:pPr>
+    </w:p>
+    <w:p>
+      <w:pPr>
+        <w:keepNext/>
+        <w:spacing w:after="80" w:before="160"/>
+      </w:pPr>
+      <w:r>
+        <w:rPr>
+          <w:b/>
+          <w:bCs/>
+          <w:color w:val="1F4E79"/>
+        </w:rPr>
+        <w:t xml:space="preserve">Capture 22 : </w:t>
+      </w:r>
+      <w:r>
+        <w:t xml:space="preserve">Le client cherche la MAC du serveur web, qui est sur le même réseau.</w:t>
+      </w:r>
+    </w:p>
+    <w:tbl>
+      <w:tblPr>
+        <w:tblW w:type="dxa" w:w="9638"/>
+        <w:tblBorders>
+          <w:top w:val="single" w:color="auto" w:sz="4"/>
+          <w:left w:val="single" w:color="auto" w:sz="4"/>
+          <w:bottom w:val="single" w:color="auto" w:sz="4"/>
+          <w:right w:val="single" w:color="auto" w:sz="4"/>
+          <w:insideH w:val="single" w:color="auto" w:sz="4"/>
+          <w:insideV w:val="single" w:color="auto" w:sz="4"/>
+        </w:tblBorders>
+      </w:tblPr>
+      <w:tblGrid>
+        <w:gridCol w:w="9638"/>
+      </w:tblGrid>
+      <w:tr>
+        <w:trPr>
+          <w:trHeight w:val="2200" w:hRule="atLeast"/>
+        </w:trPr>
+        <w:tc>
+          <w:tcPr>
+            <w:tcW w:type="dxa" w:w="9638"/>
+            <w:tcBorders>
+              <w:top w:val="dashed" w:color="8EA9C8" w:sz="8"/>
+              <w:left w:val="dashed" w:color="8EA9C8" w:sz="8"/>
+              <w:bottom w:val="dashed" w:color="8EA9C8" w:sz="8"/>
+              <w:right w:val="dashed" w:color="8EA9C8" w:sz="8"/>
+            </w:tcBorders>
+            <w:shd w:fill="F3F7FB" w:color="auto" w:val="clear"/>
+            <w:vAlign w:val="center"/>
+          </w:tcPr>
+          <w:p>
+            <w:pPr>
+              <w:jc w:val="center"/>
+            </w:pPr>
+            <w:r>
+              <w:rPr>
+                <w:b/>
+                <w:bCs/>
+                <w:color w:val="5B7FA6"/>
+              </w:rPr>
+              <w:t xml:space="preserve">[ Coller la capture ici ]</w:t>
+            </w:r>
+          </w:p>
+        </w:tc>
+      </w:tr>
+    </w:tbl>
+    <w:p>
+      <w:pPr>
+        <w:spacing w:after="200"/>
+      </w:pPr>
+    </w:p>
+    <w:p>
+      <w:pPr>
+        <w:keepNext/>
+        <w:spacing w:after="80" w:before="160"/>
+      </w:pPr>
+      <w:r>
+        <w:rPr>
+          <w:b/>
+          <w:bCs/>
+          <w:color w:val="1F4E79"/>
+        </w:rPr>
+        <w:t xml:space="preserve">Capture 23 : </w:t>
+      </w:r>
+      <w:r>
+        <w:t xml:space="preserve">Le client cherche la MAC de la passerelle pour joindre Internet.</w:t>
+      </w:r>
+    </w:p>
+    <w:p>
+      <w:pPr>
+        <w:spacing w:after="240"/>
+        <w:jc w:val="center"/>
+      </w:pPr>
+      <w:r>
+        <w:drawing>
+          <wp:inline distT="0" distB="0" distL="0" distR="0">
+            <wp:extent cx="5715000" cy="1504950"/>
+            <wp:effectExtent t="0" r="0" b="0" l="0"/>
+            <wp:docPr id="1" name="16.png" descr="Capture d’écran" title="16.png"/>
+            <wp:cNvGraphicFramePr>
+              <a:graphicFrameLocks xmlns:a="http://schemas.openxmlformats.org/drawingml/2006/main" noChangeAspect="1"/>
+            </wp:cNvGraphicFramePr>
+            <a:graphic xmlns:a="http://schemas.openxmlformats.org/drawingml/2006/main">
+              <a:graphicData uri="http://schemas.openxmlformats.org/drawingml/2006/picture">
+                <pic:pic xmlns:pic="http://schemas.openxmlformats.org/drawingml/2006/picture">
+                  <pic:nvPicPr>
+                    <pic:cNvPr id="0" name="" descr=""/>
+                    <pic:cNvPicPr>
+                      <a:picLocks noChangeAspect="1" noChangeArrowheads="1"/>
+                    </pic:cNvPicPr>
+                  </pic:nvPicPr>
+                  <pic:blipFill>
+                    <a:blip r:embed="rId14" cstate="none"/>
+                    <a:srcRect/>
+                    <a:stretch>
+                      <a:fillRect/>
+                    </a:stretch>
+                  </pic:blipFill>
+                  <pic:spPr bwMode="auto">
+                    <a:xfrm>
+                      <a:off x="0" y="0"/>
                       <a:ext cx="5715000" cy="1504950"/>
                     </a:xfrm>
                     <a:prstGeom prst="rect">
@@ -2296,7 +2290,7 @@
                     </pic:cNvPicPr>
                   </pic:nvPicPr>
                   <pic:blipFill>
-                    <a:blip r:embed="rId14" cstate="none"/>
+                    <a:blip r:embed="rId15" cstate="none"/>
                     <a:srcRect/>
                     <a:stretch>
                       <a:fillRect/>

</xml_diff>